<commit_message>
Add mandatory compliance statements to help and manuals
</commit_message>
<xml_diff>
--- a/docs/CUSTOMER_VERIFICATION_GUIDE.docx
+++ b/docs/CUSTOMER_VERIFICATION_GUIDE.docx
@@ -643,6 +643,169 @@
         <w:t xml:space="preserve"/>
       </w:r>
     </w:p>
+    <w:p>
+      <w:pPr>
+        <w:pStyle w:val="Heading2"/>
+        <w:spacing w:before="220" w:after="100"/>
+      </w:pPr>
+      <w:r>
+        <w:t xml:space="preserve">7. Mandatory Compliance Statements</w:t>
+      </w:r>
+    </w:p>
+    <w:p>
+      <w:pPr>
+        <w:pStyle w:val="Heading3"/>
+        <w:spacing w:before="180" w:after="80"/>
+      </w:pPr>
+      <w:r>
+        <w:t xml:space="preserve">7.1 UK GDPR &amp; Data Protection notice</w:t>
+      </w:r>
+    </w:p>
+    <w:p>
+      <w:pPr>
+        <w:spacing w:after="80"/>
+      </w:pPr>
+      <w:r>
+        <w:t xml:space="preserve">{{APP_NAME}} processes personal data in accordance with UK GDPR and the Data Protection Act 2018. Data protection queries must be directed to {{DPO_EMAIL}} or {{SUPER_ADMIN_EMAIL}}.</w:t>
+      </w:r>
+    </w:p>
+    <w:p>
+      <w:r>
+        <w:t xml:space="preserve"/>
+      </w:r>
+    </w:p>
+    <w:p>
+      <w:pPr>
+        <w:pStyle w:val="Heading3"/>
+        <w:spacing w:before="180" w:after="80"/>
+      </w:pPr>
+      <w:r>
+        <w:t xml:space="preserve">7.2 Security &amp; Access Control statement</w:t>
+      </w:r>
+    </w:p>
+    <w:p>
+      <w:pPr>
+        <w:spacing w:after="80"/>
+      </w:pPr>
+      <w:r>
+        <w:t xml:space="preserve">The platform enforces role-based access control (Super Admin, Licensee, Manufacturer), encrypted HTTPS communication, secure password handling, and audit logging of critical actions.</w:t>
+      </w:r>
+    </w:p>
+    <w:p>
+      <w:r>
+        <w:t xml:space="preserve"/>
+      </w:r>
+    </w:p>
+    <w:p>
+      <w:pPr>
+        <w:pStyle w:val="Heading3"/>
+        <w:spacing w:before="180" w:after="80"/>
+      </w:pPr>
+      <w:r>
+        <w:t xml:space="preserve">7.3 Incident Response &amp; Fraud Reporting</w:t>
+      </w:r>
+    </w:p>
+    <w:p>
+      <w:pPr>
+        <w:spacing w:after="80"/>
+      </w:pPr>
+      <w:r>
+        <w:t xml:space="preserve">Controlled process: report intake -&gt; review -&gt; containment -&gt; documentation -&gt; resolution.</w:t>
+      </w:r>
+    </w:p>
+    <w:p>
+      <w:r>
+        <w:t xml:space="preserve"/>
+      </w:r>
+    </w:p>
+    <w:p>
+      <w:pPr>
+        <w:pStyle w:val="Heading3"/>
+        <w:spacing w:before="180" w:after="80"/>
+      </w:pPr>
+      <w:r>
+        <w:t xml:space="preserve">7.4 QR Code Usage &amp; Non-Duplication policy</w:t>
+      </w:r>
+    </w:p>
+    <w:p>
+      <w:pPr>
+        <w:spacing w:after="80"/>
+      </w:pPr>
+      <w:r>
+        <w:t xml:space="preserve">All QR codes are unique, traceable, and single-use where applicable. QR codes must not be duplicated, altered, or reused.</w:t>
+      </w:r>
+    </w:p>
+    <w:p>
+      <w:r>
+        <w:t xml:space="preserve"/>
+      </w:r>
+    </w:p>
+    <w:p>
+      <w:pPr>
+        <w:pStyle w:val="Heading3"/>
+        <w:spacing w:before="180" w:after="80"/>
+      </w:pPr>
+      <w:r>
+        <w:t xml:space="preserve">7.5 Audit Logging notice</w:t>
+      </w:r>
+    </w:p>
+    <w:p>
+      <w:pPr>
+        <w:spacing w:after="80"/>
+      </w:pPr>
+      <w:r>
+        <w:t xml:space="preserve">Administrative actions, QR allocations, fraud reports, and login attempts are logged and retained for {{RETENTION_DAYS}} days.</w:t>
+      </w:r>
+    </w:p>
+    <w:p>
+      <w:r>
+        <w:t xml:space="preserve"/>
+      </w:r>
+    </w:p>
+    <w:p>
+      <w:pPr>
+        <w:pStyle w:val="Heading3"/>
+        <w:spacing w:before="180" w:after="80"/>
+      </w:pPr>
+      <w:r>
+        <w:t xml:space="preserve">7.6 Acceptable Use clause</w:t>
+      </w:r>
+    </w:p>
+    <w:p>
+      <w:pPr>
+        <w:spacing w:after="80"/>
+      </w:pPr>
+      <w:r>
+        <w:t xml:space="preserve">Unauthorized access, reverse engineering, misuse of fraud reporting, or interference with system security is prohibited.</w:t>
+      </w:r>
+    </w:p>
+    <w:p>
+      <w:r>
+        <w:t xml:space="preserve"/>
+      </w:r>
+    </w:p>
+    <w:p>
+      <w:pPr>
+        <w:pStyle w:val="Heading3"/>
+        <w:spacing w:before="180" w:after="80"/>
+      </w:pPr>
+      <w:r>
+        <w:t xml:space="preserve">7.7 Hosting &amp; Disclaimer statement</w:t>
+      </w:r>
+    </w:p>
+    <w:p>
+      <w:pPr>
+        <w:spacing w:after="80"/>
+      </w:pPr>
+      <w:r>
+        <w:t xml:space="preserve">The platform is hosted via {{HOSTING_PROVIDER}} with reasonable security controls and is provided on a best-effort basis.</w:t>
+      </w:r>
+    </w:p>
+    <w:p>
+      <w:r>
+        <w:t xml:space="preserve"/>
+      </w:r>
+    </w:p>
     <w:sectPr>
       <w:pgSz w:w="11906" w:h="16838" w:orient="portrait"/>
       <w:pgMar w:top="1440" w:right="1440" w:bottom="1440" w:left="1440" w:header="708" w:footer="708" w:gutter="0"/>

</xml_diff>